<commit_message>
P2/P7/P8/P9 resolvidos e propagados
- E-mail ativo via Microsoft 365; armazenamento recomendado
  SharePoint/OneDrive do tenant (árvore de pastas inalterada)
- Escala única de níveis: Explorador/Praticante/Especialista/Arquiteto
  com temas (Fundamentos/Aplicação/Autonomia/Multiplicação) — marca,
  proposta, ficha do portal e modelo de plano de capacitação atualizados
- Parcerias oficiais confirmadas (uso gratuito) — R14 resolvido,
  comprovantes a arquivar no Drive
- SLA honesto para equipe de 2 fixado no template: monitoramento 24/7
  automatizado, suporte 9h-18h úteis, emergência S1 4h corridas
  (8h-22h), disponibilidade-alvo 99,5% — 'suporte 24/7' proibido

Co-Authored-By: Claude Fable 5 <noreply@anthropic.com>
Claude-Session: https://claude.ai/code/session_016RZJT8nVEB7u33HvjY5KvZ
</commit_message>
<xml_diff>
--- a/08-materiais/modelos/plano-capacitacao-modelo.docx
+++ b/08-materiais/modelos/plano-capacitacao-modelo.docx
@@ -335,10 +335,10 @@
         </w:tblBorders>
       </w:tblPr>
       <w:tblGrid>
-        <w:gridCol w:w="1900"/>
-        <w:gridCol w:w="2900"/>
-        <w:gridCol w:w="2650"/>
-        <w:gridCol w:w="1900"/>
+        <w:gridCol w:w="2300"/>
+        <w:gridCol w:w="2700"/>
+        <w:gridCol w:w="2550"/>
+        <w:gridCol w:w="1800"/>
       </w:tblGrid>
       <w:tr>
         <w:trPr>
@@ -346,7 +346,7 @@
         </w:trPr>
         <w:tc>
           <w:tcPr>
-            <w:tcW w:type="dxa" w:w="1900"/>
+            <w:tcW w:type="dxa" w:w="2300"/>
             <w:shd w:fill="1B2A4A" w:val="clear"/>
             <w:tcMar>
               <w:top w:type="dxa" w:w="100"/>
@@ -365,13 +365,13 @@
                 <w:sz w:val="20"/>
                 <w:szCs w:val="20"/>
               </w:rPr>
-              <w:t xml:space="preserve">Fase</w:t>
-            </w:r>
-          </w:p>
-        </w:tc>
-        <w:tc>
-          <w:tcPr>
-            <w:tcW w:type="dxa" w:w="2900"/>
+              <w:t xml:space="preserve">Nível</w:t>
+            </w:r>
+          </w:p>
+        </w:tc>
+        <w:tc>
+          <w:tcPr>
+            <w:tcW w:type="dxa" w:w="2700"/>
             <w:shd w:fill="1B2A4A" w:val="clear"/>
             <w:tcMar>
               <w:top w:type="dxa" w:w="100"/>
@@ -396,7 +396,7 @@
         </w:tc>
         <w:tc>
           <w:tcPr>
-            <w:tcW w:type="dxa" w:w="2650"/>
+            <w:tcW w:type="dxa" w:w="2550"/>
             <w:shd w:fill="1B2A4A" w:val="clear"/>
             <w:tcMar>
               <w:top w:type="dxa" w:w="100"/>
@@ -421,7 +421,7 @@
         </w:tc>
         <w:tc>
           <w:tcPr>
-            <w:tcW w:type="dxa" w:w="1900"/>
+            <w:tcW w:type="dxa" w:w="1800"/>
             <w:shd w:fill="1B2A4A" w:val="clear"/>
             <w:tcMar>
               <w:top w:type="dxa" w:w="100"/>
@@ -448,7 +448,7 @@
       <w:tr>
         <w:tc>
           <w:tcPr>
-            <w:tcW w:type="dxa" w:w="1900"/>
+            <w:tcW w:type="dxa" w:w="2300"/>
             <w:shd w:fill="FFFFFF" w:val="clear"/>
             <w:tcMar>
               <w:top w:type="dxa" w:w="100"/>
@@ -467,13 +467,13 @@
                 <w:sz w:val="20"/>
                 <w:szCs w:val="20"/>
               </w:rPr>
-              <w:t xml:space="preserve">1 — Fundamentos</w:t>
-            </w:r>
-          </w:p>
-        </w:tc>
-        <w:tc>
-          <w:tcPr>
-            <w:tcW w:type="dxa" w:w="2900"/>
+              <w:t xml:space="preserve">1 — Explorador (Fundamentos)</w:t>
+            </w:r>
+          </w:p>
+        </w:tc>
+        <w:tc>
+          <w:tcPr>
+            <w:tcW w:type="dxa" w:w="2700"/>
             <w:shd w:fill="FFFFFF" w:val="clear"/>
             <w:tcMar>
               <w:top w:type="dxa" w:w="100"/>
@@ -498,7 +498,7 @@
         </w:tc>
         <w:tc>
           <w:tcPr>
-            <w:tcW w:type="dxa" w:w="2650"/>
+            <w:tcW w:type="dxa" w:w="2550"/>
             <w:shd w:fill="FFFFFF" w:val="clear"/>
             <w:tcMar>
               <w:top w:type="dxa" w:w="100"/>
@@ -523,7 +523,7 @@
         </w:tc>
         <w:tc>
           <w:tcPr>
-            <w:tcW w:type="dxa" w:w="1900"/>
+            <w:tcW w:type="dxa" w:w="1800"/>
             <w:shd w:fill="FFFFFF" w:val="clear"/>
             <w:tcMar>
               <w:top w:type="dxa" w:w="100"/>
@@ -550,7 +550,7 @@
       <w:tr>
         <w:tc>
           <w:tcPr>
-            <w:tcW w:type="dxa" w:w="1900"/>
+            <w:tcW w:type="dxa" w:w="2300"/>
             <w:shd w:fill="F4F6F9" w:val="clear"/>
             <w:tcMar>
               <w:top w:type="dxa" w:w="100"/>
@@ -569,13 +569,13 @@
                 <w:sz w:val="20"/>
                 <w:szCs w:val="20"/>
               </w:rPr>
-              <w:t xml:space="preserve">2 — Aplicação</w:t>
-            </w:r>
-          </w:p>
-        </w:tc>
-        <w:tc>
-          <w:tcPr>
-            <w:tcW w:type="dxa" w:w="2900"/>
+              <w:t xml:space="preserve">2 — Praticante (Aplicação)</w:t>
+            </w:r>
+          </w:p>
+        </w:tc>
+        <w:tc>
+          <w:tcPr>
+            <w:tcW w:type="dxa" w:w="2700"/>
             <w:shd w:fill="F4F6F9" w:val="clear"/>
             <w:tcMar>
               <w:top w:type="dxa" w:w="100"/>
@@ -600,7 +600,7 @@
         </w:tc>
         <w:tc>
           <w:tcPr>
-            <w:tcW w:type="dxa" w:w="2650"/>
+            <w:tcW w:type="dxa" w:w="2550"/>
             <w:shd w:fill="F4F6F9" w:val="clear"/>
             <w:tcMar>
               <w:top w:type="dxa" w:w="100"/>
@@ -625,7 +625,7 @@
         </w:tc>
         <w:tc>
           <w:tcPr>
-            <w:tcW w:type="dxa" w:w="1900"/>
+            <w:tcW w:type="dxa" w:w="1800"/>
             <w:shd w:fill="F4F6F9" w:val="clear"/>
             <w:tcMar>
               <w:top w:type="dxa" w:w="100"/>
@@ -652,7 +652,7 @@
       <w:tr>
         <w:tc>
           <w:tcPr>
-            <w:tcW w:type="dxa" w:w="1900"/>
+            <w:tcW w:type="dxa" w:w="2300"/>
             <w:shd w:fill="FFFFFF" w:val="clear"/>
             <w:tcMar>
               <w:top w:type="dxa" w:w="100"/>
@@ -671,13 +671,13 @@
                 <w:sz w:val="20"/>
                 <w:szCs w:val="20"/>
               </w:rPr>
-              <w:t xml:space="preserve">3 — Autonomia</w:t>
-            </w:r>
-          </w:p>
-        </w:tc>
-        <w:tc>
-          <w:tcPr>
-            <w:tcW w:type="dxa" w:w="2900"/>
+              <w:t xml:space="preserve">3 — Especialista (Autonomia)</w:t>
+            </w:r>
+          </w:p>
+        </w:tc>
+        <w:tc>
+          <w:tcPr>
+            <w:tcW w:type="dxa" w:w="2700"/>
             <w:shd w:fill="FFFFFF" w:val="clear"/>
             <w:tcMar>
               <w:top w:type="dxa" w:w="100"/>
@@ -702,7 +702,7 @@
         </w:tc>
         <w:tc>
           <w:tcPr>
-            <w:tcW w:type="dxa" w:w="2650"/>
+            <w:tcW w:type="dxa" w:w="2550"/>
             <w:shd w:fill="FFFFFF" w:val="clear"/>
             <w:tcMar>
               <w:top w:type="dxa" w:w="100"/>
@@ -727,7 +727,7 @@
         </w:tc>
         <w:tc>
           <w:tcPr>
-            <w:tcW w:type="dxa" w:w="1900"/>
+            <w:tcW w:type="dxa" w:w="1800"/>
             <w:shd w:fill="FFFFFF" w:val="clear"/>
             <w:tcMar>
               <w:top w:type="dxa" w:w="100"/>
@@ -754,7 +754,7 @@
       <w:tr>
         <w:tc>
           <w:tcPr>
-            <w:tcW w:type="dxa" w:w="1900"/>
+            <w:tcW w:type="dxa" w:w="2300"/>
             <w:shd w:fill="F4F6F9" w:val="clear"/>
             <w:tcMar>
               <w:top w:type="dxa" w:w="100"/>
@@ -773,13 +773,13 @@
                 <w:sz w:val="20"/>
                 <w:szCs w:val="20"/>
               </w:rPr>
-              <w:t xml:space="preserve">4 — Multiplicação</w:t>
-            </w:r>
-          </w:p>
-        </w:tc>
-        <w:tc>
-          <w:tcPr>
-            <w:tcW w:type="dxa" w:w="2900"/>
+              <w:t xml:space="preserve">4 — Arquiteto (Multiplicação)</w:t>
+            </w:r>
+          </w:p>
+        </w:tc>
+        <w:tc>
+          <w:tcPr>
+            <w:tcW w:type="dxa" w:w="2700"/>
             <w:shd w:fill="F4F6F9" w:val="clear"/>
             <w:tcMar>
               <w:top w:type="dxa" w:w="100"/>
@@ -804,7 +804,7 @@
         </w:tc>
         <w:tc>
           <w:tcPr>
-            <w:tcW w:type="dxa" w:w="2650"/>
+            <w:tcW w:type="dxa" w:w="2550"/>
             <w:shd w:fill="F4F6F9" w:val="clear"/>
             <w:tcMar>
               <w:top w:type="dxa" w:w="100"/>
@@ -829,7 +829,7 @@
         </w:tc>
         <w:tc>
           <w:tcPr>
-            <w:tcW w:type="dxa" w:w="1900"/>
+            <w:tcW w:type="dxa" w:w="1800"/>
             <w:shd w:fill="F4F6F9" w:val="clear"/>
             <w:tcMar>
               <w:top w:type="dxa" w:w="100"/>

</xml_diff>